<commit_message>
Yayın: foseptik bedeli önceki inşaat proformasına sabitlendi
Co-Authored-By: Claude Opus 5 <noreply@anthropic.com>
Claude-Session: https://claude.ai/code/session_01HJPp6bx7wepUX5p8fxGcjg
</commit_message>
<xml_diff>
--- a/belgeler/22_A6_MALIYETLERI_GEREKCELENDIRME.docx
+++ b/belgeler/22_A6_MALIYETLERI_GEREKCELENDIRME.docx
@@ -649,7 +649,7 @@
                 <w:color w:val="000000"/>
                 <w:sz w:val="16"/>
               </w:rPr>
-              <w:t>59.276,30</w:t>
+              <w:t>81.237,96</w:t>
             </w:r>
           </w:p>
         </w:tc>
@@ -1207,7 +1207,7 @@
                 <w:color w:val="000000"/>
                 <w:sz w:val="16"/>
               </w:rPr>
-              <w:t>25.161.130,80</w:t>
+              <w:t>25.183.092,46</w:t>
             </w:r>
           </w:p>
         </w:tc>

</xml_diff>